<commit_message>
Mẫu phiếu lương: cố định độ rộng cột, vừa một trang A4
Co-Authored-By: Claude Opus 5.5 <noreply@anthropic.com>
</commit_message>
<xml_diff>
--- a/core/src/main/resources/templates/DOIT_PhieuLuong_template.docx
+++ b/core/src/main/resources/templates/DOIT_PhieuLuong_template.docx
@@ -31,11 +31,13 @@
     <w:tbl>
       <w:tblPr>
         <w:tblW w:type="auto" w:w="0"/>
+        <w:tblLayout w:type="fixed"/>
         <w:tblLook w:firstColumn="1" w:firstRow="1" w:lastColumn="0" w:lastRow="0" w:noHBand="0" w:noVBand="1" w:val="04A0"/>
+        <w:tblLayout w:type="fixed"/>
       </w:tblPr>
       <w:tblGrid>
-        <w:gridCol w:w="4819"/>
-        <w:gridCol w:w="4819"/>
+        <w:gridCol w:w="4535"/>
+        <w:gridCol w:w="5102"/>
       </w:tblGrid>
       <w:tr>
         <w:tc>
@@ -146,17 +148,19 @@
         <w:tblStyle w:val="TableGrid"/>
         <w:tblW w:type="auto" w:w="0"/>
         <w:jc w:val="center"/>
+        <w:tblLayout w:type="fixed"/>
         <w:tblLook w:firstColumn="1" w:firstRow="1" w:lastColumn="0" w:lastRow="0" w:noHBand="0" w:noVBand="1" w:val="04A0"/>
+        <w:tblLayout w:type="fixed"/>
       </w:tblPr>
       <w:tblGrid>
-        <w:gridCol w:w="3213"/>
-        <w:gridCol w:w="3213"/>
-        <w:gridCol w:w="3213"/>
+        <w:gridCol w:w="4989"/>
+        <w:gridCol w:w="2835"/>
+        <w:gridCol w:w="1814"/>
       </w:tblGrid>
       <w:tr>
         <w:tc>
           <w:tcPr>
-            <w:tcW w:type="dxa" w:w="5102"/>
+            <w:tcW w:type="dxa" w:w="4989"/>
             <w:shd w:val="clear" w:color="auto" w:fill="D9E2F3"/>
           </w:tcPr>
           <w:p>
@@ -167,6 +171,7 @@
               <w:rPr>
                 <w:b/>
                 <w:i w:val="0"/>
+                <w:sz w:val="22"/>
               </w:rPr>
               <w:t>Nội dung</w:t>
             </w:r>
@@ -174,7 +179,7 @@
         </w:tc>
         <w:tc>
           <w:tcPr>
-            <w:tcW w:type="dxa" w:w="2551"/>
+            <w:tcW w:type="dxa" w:w="2835"/>
             <w:shd w:val="clear" w:color="auto" w:fill="D9E2F3"/>
           </w:tcPr>
           <w:p>
@@ -185,6 +190,7 @@
               <w:rPr>
                 <w:b/>
                 <w:i w:val="0"/>
+                <w:sz w:val="22"/>
               </w:rPr>
               <w:t>Ký hiệu</w:t>
             </w:r>
@@ -192,7 +198,7 @@
         </w:tc>
         <w:tc>
           <w:tcPr>
-            <w:tcW w:type="dxa" w:w="1984"/>
+            <w:tcW w:type="dxa" w:w="1814"/>
             <w:shd w:val="clear" w:color="auto" w:fill="D9E2F3"/>
           </w:tcPr>
           <w:p>
@@ -203,6 +209,7 @@
               <w:rPr>
                 <w:b/>
                 <w:i w:val="0"/>
+                <w:sz w:val="22"/>
               </w:rPr>
               <w:t>Số tiền</w:t>
             </w:r>
@@ -212,13 +219,14 @@
       <w:tr>
         <w:tc>
           <w:tcPr>
-            <w:tcW w:type="dxa" w:w="5102"/>
+            <w:tcW w:type="dxa" w:w="4989"/>
           </w:tcPr>
           <w:p>
             <w:r>
               <w:rPr>
                 <w:b/>
                 <w:i w:val="0"/>
+                <w:sz w:val="22"/>
               </w:rPr>
               <w:t>Mức lương gộp hàng tháng, bao gồm:</w:t>
             </w:r>
@@ -226,7 +234,7 @@
         </w:tc>
         <w:tc>
           <w:tcPr>
-            <w:tcW w:type="dxa" w:w="2551"/>
+            <w:tcW w:type="dxa" w:w="2835"/>
           </w:tcPr>
           <w:p>
             <w:pPr>
@@ -236,6 +244,7 @@
               <w:rPr>
                 <w:b w:val="0"/>
                 <w:i/>
+                <w:sz w:val="20"/>
               </w:rPr>
               <w:t>a = a1 + a2</w:t>
             </w:r>
@@ -243,7 +252,7 @@
         </w:tc>
         <w:tc>
           <w:tcPr>
-            <w:tcW w:type="dxa" w:w="1984"/>
+            <w:tcW w:type="dxa" w:w="1814"/>
           </w:tcPr>
           <w:p>
             <w:pPr>
@@ -253,6 +262,7 @@
               <w:rPr>
                 <w:b/>
                 <w:i w:val="0"/>
+                <w:sz w:val="22"/>
               </w:rPr>
               <w:t>{{a}}</w:t>
             </w:r>
@@ -262,13 +272,14 @@
       <w:tr>
         <w:tc>
           <w:tcPr>
-            <w:tcW w:type="dxa" w:w="5102"/>
+            <w:tcW w:type="dxa" w:w="4989"/>
           </w:tcPr>
           <w:p>
             <w:r>
               <w:rPr>
                 <w:b w:val="0"/>
                 <w:i w:val="0"/>
+                <w:sz w:val="22"/>
               </w:rPr>
               <w:t>- Mức lương theo HĐLĐ</w:t>
             </w:r>
@@ -276,7 +287,7 @@
         </w:tc>
         <w:tc>
           <w:tcPr>
-            <w:tcW w:type="dxa" w:w="2551"/>
+            <w:tcW w:type="dxa" w:w="2835"/>
           </w:tcPr>
           <w:p>
             <w:pPr>
@@ -286,6 +297,7 @@
               <w:rPr>
                 <w:b w:val="0"/>
                 <w:i/>
+                <w:sz w:val="20"/>
               </w:rPr>
               <w:t>a1</w:t>
             </w:r>
@@ -293,7 +305,7 @@
         </w:tc>
         <w:tc>
           <w:tcPr>
-            <w:tcW w:type="dxa" w:w="1984"/>
+            <w:tcW w:type="dxa" w:w="1814"/>
           </w:tcPr>
           <w:p>
             <w:pPr>
@@ -303,6 +315,7 @@
               <w:rPr>
                 <w:b w:val="0"/>
                 <w:i w:val="0"/>
+                <w:sz w:val="22"/>
               </w:rPr>
               <w:t>{{a1}}</w:t>
             </w:r>
@@ -312,13 +325,14 @@
       <w:tr>
         <w:tc>
           <w:tcPr>
-            <w:tcW w:type="dxa" w:w="5102"/>
+            <w:tcW w:type="dxa" w:w="4989"/>
           </w:tcPr>
           <w:p>
             <w:r>
               <w:rPr>
                 <w:b w:val="0"/>
                 <w:i w:val="0"/>
+                <w:sz w:val="22"/>
               </w:rPr>
               <w:t>- Phụ cấp lương tính đóng BHXH</w:t>
             </w:r>
@@ -326,7 +340,7 @@
         </w:tc>
         <w:tc>
           <w:tcPr>
-            <w:tcW w:type="dxa" w:w="2551"/>
+            <w:tcW w:type="dxa" w:w="2835"/>
           </w:tcPr>
           <w:p>
             <w:pPr>
@@ -336,6 +350,7 @@
               <w:rPr>
                 <w:b w:val="0"/>
                 <w:i/>
+                <w:sz w:val="20"/>
               </w:rPr>
               <w:t>a2</w:t>
             </w:r>
@@ -343,7 +358,7 @@
         </w:tc>
         <w:tc>
           <w:tcPr>
-            <w:tcW w:type="dxa" w:w="1984"/>
+            <w:tcW w:type="dxa" w:w="1814"/>
           </w:tcPr>
           <w:p>
             <w:pPr>
@@ -353,6 +368,7 @@
               <w:rPr>
                 <w:b w:val="0"/>
                 <w:i w:val="0"/>
+                <w:sz w:val="22"/>
               </w:rPr>
               <w:t>{{a2}}</w:t>
             </w:r>
@@ -362,13 +378,14 @@
       <w:tr>
         <w:tc>
           <w:tcPr>
-            <w:tcW w:type="dxa" w:w="5102"/>
+            <w:tcW w:type="dxa" w:w="4989"/>
           </w:tcPr>
           <w:p>
             <w:r>
               <w:rPr>
                 <w:b/>
                 <w:i w:val="0"/>
+                <w:sz w:val="22"/>
               </w:rPr>
               <w:t>Số ngày công thực tế</w:t>
             </w:r>
@@ -376,7 +393,7 @@
         </w:tc>
         <w:tc>
           <w:tcPr>
-            <w:tcW w:type="dxa" w:w="2551"/>
+            <w:tcW w:type="dxa" w:w="2835"/>
           </w:tcPr>
           <w:p>
             <w:pPr>
@@ -386,6 +403,7 @@
               <w:rPr>
                 <w:b w:val="0"/>
                 <w:i/>
+                <w:sz w:val="20"/>
               </w:rPr>
               <w:t>b</w:t>
             </w:r>
@@ -393,7 +411,7 @@
         </w:tc>
         <w:tc>
           <w:tcPr>
-            <w:tcW w:type="dxa" w:w="1984"/>
+            <w:tcW w:type="dxa" w:w="1814"/>
           </w:tcPr>
           <w:p>
             <w:pPr>
@@ -403,6 +421,7 @@
               <w:rPr>
                 <w:b/>
                 <w:i w:val="0"/>
+                <w:sz w:val="22"/>
               </w:rPr>
               <w:t>{{b}}</w:t>
             </w:r>
@@ -412,13 +431,14 @@
       <w:tr>
         <w:tc>
           <w:tcPr>
-            <w:tcW w:type="dxa" w:w="5102"/>
+            <w:tcW w:type="dxa" w:w="4989"/>
           </w:tcPr>
           <w:p>
             <w:r>
               <w:rPr>
                 <w:b/>
                 <w:i w:val="0"/>
+                <w:sz w:val="22"/>
               </w:rPr>
               <w:t>Tổng lương gộp trong tháng</w:t>
             </w:r>
@@ -426,7 +446,7 @@
         </w:tc>
         <w:tc>
           <w:tcPr>
-            <w:tcW w:type="dxa" w:w="2551"/>
+            <w:tcW w:type="dxa" w:w="2835"/>
           </w:tcPr>
           <w:p>
             <w:pPr>
@@ -436,6 +456,7 @@
               <w:rPr>
                 <w:b w:val="0"/>
                 <w:i/>
+                <w:sz w:val="20"/>
               </w:rPr>
               <w:t>c = a1/(1) × b + a2</w:t>
             </w:r>
@@ -443,7 +464,7 @@
         </w:tc>
         <w:tc>
           <w:tcPr>
-            <w:tcW w:type="dxa" w:w="1984"/>
+            <w:tcW w:type="dxa" w:w="1814"/>
           </w:tcPr>
           <w:p>
             <w:pPr>
@@ -453,6 +474,7 @@
               <w:rPr>
                 <w:b/>
                 <w:i w:val="0"/>
+                <w:sz w:val="22"/>
               </w:rPr>
               <w:t>{{c}}</w:t>
             </w:r>
@@ -462,13 +484,14 @@
       <w:tr>
         <w:tc>
           <w:tcPr>
-            <w:tcW w:type="dxa" w:w="5102"/>
+            <w:tcW w:type="dxa" w:w="4989"/>
           </w:tcPr>
           <w:p>
             <w:r>
               <w:rPr>
                 <w:b/>
                 <w:i w:val="0"/>
+                <w:sz w:val="22"/>
               </w:rPr>
               <w:t>Thưởng dự án</w:t>
             </w:r>
@@ -476,7 +499,7 @@
         </w:tc>
         <w:tc>
           <w:tcPr>
-            <w:tcW w:type="dxa" w:w="2551"/>
+            <w:tcW w:type="dxa" w:w="2835"/>
           </w:tcPr>
           <w:p>
             <w:pPr>
@@ -486,6 +509,7 @@
               <w:rPr>
                 <w:b w:val="0"/>
                 <w:i/>
+                <w:sz w:val="20"/>
               </w:rPr>
               <w:t>d</w:t>
             </w:r>
@@ -493,7 +517,7 @@
         </w:tc>
         <w:tc>
           <w:tcPr>
-            <w:tcW w:type="dxa" w:w="1984"/>
+            <w:tcW w:type="dxa" w:w="1814"/>
           </w:tcPr>
           <w:p>
             <w:pPr>
@@ -503,6 +527,7 @@
               <w:rPr>
                 <w:b/>
                 <w:i w:val="0"/>
+                <w:sz w:val="22"/>
               </w:rPr>
               <w:t>{{d}}</w:t>
             </w:r>
@@ -512,13 +537,14 @@
       <w:tr>
         <w:tc>
           <w:tcPr>
-            <w:tcW w:type="dxa" w:w="5102"/>
+            <w:tcW w:type="dxa" w:w="4989"/>
           </w:tcPr>
           <w:p>
             <w:r>
               <w:rPr>
                 <w:b/>
                 <w:i w:val="0"/>
+                <w:sz w:val="22"/>
               </w:rPr>
               <w:t>Thu nhập khác, bao gồm:</w:t>
             </w:r>
@@ -526,7 +552,7 @@
         </w:tc>
         <w:tc>
           <w:tcPr>
-            <w:tcW w:type="dxa" w:w="2551"/>
+            <w:tcW w:type="dxa" w:w="2835"/>
           </w:tcPr>
           <w:p>
             <w:pPr>
@@ -536,6 +562,7 @@
               <w:rPr>
                 <w:b w:val="0"/>
                 <w:i/>
+                <w:sz w:val="20"/>
               </w:rPr>
               <w:t>e = e1 + … + e6</w:t>
             </w:r>
@@ -543,7 +570,7 @@
         </w:tc>
         <w:tc>
           <w:tcPr>
-            <w:tcW w:type="dxa" w:w="1984"/>
+            <w:tcW w:type="dxa" w:w="1814"/>
           </w:tcPr>
           <w:p>
             <w:pPr>
@@ -553,6 +580,7 @@
               <w:rPr>
                 <w:b/>
                 <w:i w:val="0"/>
+                <w:sz w:val="22"/>
               </w:rPr>
               <w:t>{{e}}</w:t>
             </w:r>
@@ -562,13 +590,14 @@
       <w:tr>
         <w:tc>
           <w:tcPr>
-            <w:tcW w:type="dxa" w:w="5102"/>
+            <w:tcW w:type="dxa" w:w="4989"/>
           </w:tcPr>
           <w:p>
             <w:r>
               <w:rPr>
                 <w:b w:val="0"/>
                 <w:i w:val="0"/>
+                <w:sz w:val="22"/>
               </w:rPr>
               <w:t>- Lương chuyên cần</w:t>
             </w:r>
@@ -576,7 +605,7 @@
         </w:tc>
         <w:tc>
           <w:tcPr>
-            <w:tcW w:type="dxa" w:w="2551"/>
+            <w:tcW w:type="dxa" w:w="2835"/>
           </w:tcPr>
           <w:p>
             <w:pPr>
@@ -586,6 +615,7 @@
               <w:rPr>
                 <w:b w:val="0"/>
                 <w:i/>
+                <w:sz w:val="20"/>
               </w:rPr>
               <w:t>e1</w:t>
             </w:r>
@@ -593,7 +623,7 @@
         </w:tc>
         <w:tc>
           <w:tcPr>
-            <w:tcW w:type="dxa" w:w="1984"/>
+            <w:tcW w:type="dxa" w:w="1814"/>
           </w:tcPr>
           <w:p>
             <w:pPr>
@@ -603,6 +633,7 @@
               <w:rPr>
                 <w:b w:val="0"/>
                 <w:i w:val="0"/>
+                <w:sz w:val="22"/>
               </w:rPr>
               <w:t>{{e1}}</w:t>
             </w:r>
@@ -612,13 +643,14 @@
       <w:tr>
         <w:tc>
           <w:tcPr>
-            <w:tcW w:type="dxa" w:w="5102"/>
+            <w:tcW w:type="dxa" w:w="4989"/>
           </w:tcPr>
           <w:p>
             <w:r>
               <w:rPr>
                 <w:b w:val="0"/>
                 <w:i w:val="0"/>
+                <w:sz w:val="22"/>
               </w:rPr>
               <w:t>- Phụ cấp trách nhiệm</w:t>
             </w:r>
@@ -626,7 +658,7 @@
         </w:tc>
         <w:tc>
           <w:tcPr>
-            <w:tcW w:type="dxa" w:w="2551"/>
+            <w:tcW w:type="dxa" w:w="2835"/>
           </w:tcPr>
           <w:p>
             <w:pPr>
@@ -636,6 +668,7 @@
               <w:rPr>
                 <w:b w:val="0"/>
                 <w:i/>
+                <w:sz w:val="20"/>
               </w:rPr>
               <w:t>e2</w:t>
             </w:r>
@@ -643,7 +676,7 @@
         </w:tc>
         <w:tc>
           <w:tcPr>
-            <w:tcW w:type="dxa" w:w="1984"/>
+            <w:tcW w:type="dxa" w:w="1814"/>
           </w:tcPr>
           <w:p>
             <w:pPr>
@@ -653,6 +686,7 @@
               <w:rPr>
                 <w:b w:val="0"/>
                 <w:i w:val="0"/>
+                <w:sz w:val="22"/>
               </w:rPr>
               <w:t>{{e2}}</w:t>
             </w:r>
@@ -662,13 +696,14 @@
       <w:tr>
         <w:tc>
           <w:tcPr>
-            <w:tcW w:type="dxa" w:w="5102"/>
+            <w:tcW w:type="dxa" w:w="4989"/>
           </w:tcPr>
           <w:p>
             <w:r>
               <w:rPr>
                 <w:b w:val="0"/>
                 <w:i w:val="0"/>
+                <w:sz w:val="22"/>
               </w:rPr>
               <w:t>- Phụ cấp xăng xe</w:t>
             </w:r>
@@ -676,7 +711,7 @@
         </w:tc>
         <w:tc>
           <w:tcPr>
-            <w:tcW w:type="dxa" w:w="2551"/>
+            <w:tcW w:type="dxa" w:w="2835"/>
           </w:tcPr>
           <w:p>
             <w:pPr>
@@ -686,6 +721,7 @@
               <w:rPr>
                 <w:b w:val="0"/>
                 <w:i/>
+                <w:sz w:val="20"/>
               </w:rPr>
               <w:t>e3</w:t>
             </w:r>
@@ -693,7 +729,7 @@
         </w:tc>
         <w:tc>
           <w:tcPr>
-            <w:tcW w:type="dxa" w:w="1984"/>
+            <w:tcW w:type="dxa" w:w="1814"/>
           </w:tcPr>
           <w:p>
             <w:pPr>
@@ -703,6 +739,7 @@
               <w:rPr>
                 <w:b w:val="0"/>
                 <w:i w:val="0"/>
+                <w:sz w:val="22"/>
               </w:rPr>
               <w:t>{{e3}}</w:t>
             </w:r>
@@ -712,13 +749,14 @@
       <w:tr>
         <w:tc>
           <w:tcPr>
-            <w:tcW w:type="dxa" w:w="5102"/>
+            <w:tcW w:type="dxa" w:w="4989"/>
           </w:tcPr>
           <w:p>
             <w:r>
               <w:rPr>
                 <w:b w:val="0"/>
                 <w:i w:val="0"/>
+                <w:sz w:val="22"/>
               </w:rPr>
               <w:t>- Tiền thưởng KPI</w:t>
             </w:r>
@@ -726,7 +764,7 @@
         </w:tc>
         <w:tc>
           <w:tcPr>
-            <w:tcW w:type="dxa" w:w="2551"/>
+            <w:tcW w:type="dxa" w:w="2835"/>
           </w:tcPr>
           <w:p>
             <w:pPr>
@@ -736,6 +774,7 @@
               <w:rPr>
                 <w:b w:val="0"/>
                 <w:i/>
+                <w:sz w:val="20"/>
               </w:rPr>
               <w:t>e4</w:t>
             </w:r>
@@ -743,7 +782,7 @@
         </w:tc>
         <w:tc>
           <w:tcPr>
-            <w:tcW w:type="dxa" w:w="1984"/>
+            <w:tcW w:type="dxa" w:w="1814"/>
           </w:tcPr>
           <w:p>
             <w:pPr>
@@ -753,6 +792,7 @@
               <w:rPr>
                 <w:b w:val="0"/>
                 <w:i w:val="0"/>
+                <w:sz w:val="22"/>
               </w:rPr>
               <w:t>{{e4}}</w:t>
             </w:r>
@@ -762,13 +802,14 @@
       <w:tr>
         <w:tc>
           <w:tcPr>
-            <w:tcW w:type="dxa" w:w="5102"/>
+            <w:tcW w:type="dxa" w:w="4989"/>
           </w:tcPr>
           <w:p>
             <w:r>
               <w:rPr>
                 <w:b w:val="0"/>
                 <w:i w:val="0"/>
+                <w:sz w:val="22"/>
               </w:rPr>
               <w:t>- Tiền làm thêm giờ chịu thuế</w:t>
             </w:r>
@@ -776,7 +817,7 @@
         </w:tc>
         <w:tc>
           <w:tcPr>
-            <w:tcW w:type="dxa" w:w="2551"/>
+            <w:tcW w:type="dxa" w:w="2835"/>
           </w:tcPr>
           <w:p>
             <w:pPr>
@@ -786,6 +827,7 @@
               <w:rPr>
                 <w:b w:val="0"/>
                 <w:i/>
+                <w:sz w:val="20"/>
               </w:rPr>
               <w:t>e5</w:t>
             </w:r>
@@ -793,7 +835,7 @@
         </w:tc>
         <w:tc>
           <w:tcPr>
-            <w:tcW w:type="dxa" w:w="1984"/>
+            <w:tcW w:type="dxa" w:w="1814"/>
           </w:tcPr>
           <w:p>
             <w:pPr>
@@ -803,6 +845,7 @@
               <w:rPr>
                 <w:b w:val="0"/>
                 <w:i w:val="0"/>
+                <w:sz w:val="22"/>
               </w:rPr>
               <w:t>{{e5}}</w:t>
             </w:r>
@@ -812,13 +855,14 @@
       <w:tr>
         <w:tc>
           <w:tcPr>
-            <w:tcW w:type="dxa" w:w="5102"/>
+            <w:tcW w:type="dxa" w:w="4989"/>
           </w:tcPr>
           <w:p>
             <w:r>
               <w:rPr>
                 <w:b w:val="0"/>
                 <w:i w:val="0"/>
+                <w:sz w:val="22"/>
               </w:rPr>
               <w:t>- Trợ cấp thôi việc</w:t>
             </w:r>
@@ -826,7 +870,7 @@
         </w:tc>
         <w:tc>
           <w:tcPr>
-            <w:tcW w:type="dxa" w:w="2551"/>
+            <w:tcW w:type="dxa" w:w="2835"/>
           </w:tcPr>
           <w:p>
             <w:pPr>
@@ -836,6 +880,7 @@
               <w:rPr>
                 <w:b w:val="0"/>
                 <w:i/>
+                <w:sz w:val="20"/>
               </w:rPr>
               <w:t>e6</w:t>
             </w:r>
@@ -843,7 +888,7 @@
         </w:tc>
         <w:tc>
           <w:tcPr>
-            <w:tcW w:type="dxa" w:w="1984"/>
+            <w:tcW w:type="dxa" w:w="1814"/>
           </w:tcPr>
           <w:p>
             <w:pPr>
@@ -853,6 +898,7 @@
               <w:rPr>
                 <w:b w:val="0"/>
                 <w:i w:val="0"/>
+                <w:sz w:val="22"/>
               </w:rPr>
               <w:t>{{e6}}</w:t>
             </w:r>
@@ -862,13 +908,14 @@
       <w:tr>
         <w:tc>
           <w:tcPr>
-            <w:tcW w:type="dxa" w:w="5102"/>
+            <w:tcW w:type="dxa" w:w="4989"/>
           </w:tcPr>
           <w:p>
             <w:r>
               <w:rPr>
                 <w:b/>
                 <w:i w:val="0"/>
+                <w:sz w:val="22"/>
               </w:rPr>
               <w:t>Tiền lương ngày nghỉ phép chưa sử dụng</w:t>
             </w:r>
@@ -876,7 +923,7 @@
         </w:tc>
         <w:tc>
           <w:tcPr>
-            <w:tcW w:type="dxa" w:w="2551"/>
+            <w:tcW w:type="dxa" w:w="2835"/>
           </w:tcPr>
           <w:p>
             <w:pPr>
@@ -886,6 +933,7 @@
               <w:rPr>
                 <w:b w:val="0"/>
                 <w:i/>
+                <w:sz w:val="20"/>
               </w:rPr>
               <w:t>f</w:t>
             </w:r>
@@ -893,7 +941,7 @@
         </w:tc>
         <w:tc>
           <w:tcPr>
-            <w:tcW w:type="dxa" w:w="1984"/>
+            <w:tcW w:type="dxa" w:w="1814"/>
           </w:tcPr>
           <w:p>
             <w:pPr>
@@ -903,6 +951,7 @@
               <w:rPr>
                 <w:b/>
                 <w:i w:val="0"/>
+                <w:sz w:val="22"/>
               </w:rPr>
               <w:t>{{f}}</w:t>
             </w:r>
@@ -912,13 +961,14 @@
       <w:tr>
         <w:tc>
           <w:tcPr>
-            <w:tcW w:type="dxa" w:w="5102"/>
+            <w:tcW w:type="dxa" w:w="4989"/>
           </w:tcPr>
           <w:p>
             <w:r>
               <w:rPr>
                 <w:b/>
                 <w:i w:val="0"/>
+                <w:sz w:val="22"/>
               </w:rPr>
               <w:t>Tổng thu nhập</w:t>
             </w:r>
@@ -926,7 +976,7 @@
         </w:tc>
         <w:tc>
           <w:tcPr>
-            <w:tcW w:type="dxa" w:w="2551"/>
+            <w:tcW w:type="dxa" w:w="2835"/>
           </w:tcPr>
           <w:p>
             <w:pPr>
@@ -936,6 +986,7 @@
               <w:rPr>
                 <w:b w:val="0"/>
                 <w:i/>
+                <w:sz w:val="20"/>
               </w:rPr>
               <w:t>g = c + d + e + f</w:t>
             </w:r>
@@ -943,7 +994,7 @@
         </w:tc>
         <w:tc>
           <w:tcPr>
-            <w:tcW w:type="dxa" w:w="1984"/>
+            <w:tcW w:type="dxa" w:w="1814"/>
           </w:tcPr>
           <w:p>
             <w:pPr>
@@ -953,6 +1004,7 @@
               <w:rPr>
                 <w:b/>
                 <w:i w:val="0"/>
+                <w:sz w:val="22"/>
               </w:rPr>
               <w:t>{{g}}</w:t>
             </w:r>
@@ -962,13 +1014,14 @@
       <w:tr>
         <w:tc>
           <w:tcPr>
-            <w:tcW w:type="dxa" w:w="5102"/>
+            <w:tcW w:type="dxa" w:w="4989"/>
           </w:tcPr>
           <w:p>
             <w:r>
               <w:rPr>
                 <w:b/>
                 <w:i w:val="0"/>
+                <w:sz w:val="22"/>
               </w:rPr>
               <w:t>Khoản không tính thuế, bao gồm:</w:t>
             </w:r>
@@ -976,7 +1029,7 @@
         </w:tc>
         <w:tc>
           <w:tcPr>
-            <w:tcW w:type="dxa" w:w="2551"/>
+            <w:tcW w:type="dxa" w:w="2835"/>
           </w:tcPr>
           <w:p>
             <w:pPr>
@@ -986,6 +1039,7 @@
               <w:rPr>
                 <w:b w:val="0"/>
                 <w:i/>
+                <w:sz w:val="20"/>
               </w:rPr>
               <w:t>h = h1 + h2</w:t>
             </w:r>
@@ -993,7 +1047,7 @@
         </w:tc>
         <w:tc>
           <w:tcPr>
-            <w:tcW w:type="dxa" w:w="1984"/>
+            <w:tcW w:type="dxa" w:w="1814"/>
           </w:tcPr>
           <w:p>
             <w:pPr>
@@ -1003,6 +1057,7 @@
               <w:rPr>
                 <w:b/>
                 <w:i w:val="0"/>
+                <w:sz w:val="22"/>
               </w:rPr>
               <w:t>{{h}}</w:t>
             </w:r>
@@ -1012,13 +1067,14 @@
       <w:tr>
         <w:tc>
           <w:tcPr>
-            <w:tcW w:type="dxa" w:w="5102"/>
+            <w:tcW w:type="dxa" w:w="4989"/>
           </w:tcPr>
           <w:p>
             <w:r>
               <w:rPr>
                 <w:b w:val="0"/>
                 <w:i w:val="0"/>
+                <w:sz w:val="22"/>
               </w:rPr>
               <w:t>- Phụ cấp điện thoại</w:t>
             </w:r>
@@ -1026,7 +1082,7 @@
         </w:tc>
         <w:tc>
           <w:tcPr>
-            <w:tcW w:type="dxa" w:w="2551"/>
+            <w:tcW w:type="dxa" w:w="2835"/>
           </w:tcPr>
           <w:p>
             <w:pPr>
@@ -1036,6 +1092,7 @@
               <w:rPr>
                 <w:b w:val="0"/>
                 <w:i/>
+                <w:sz w:val="20"/>
               </w:rPr>
               <w:t>h1</w:t>
             </w:r>
@@ -1043,7 +1100,7 @@
         </w:tc>
         <w:tc>
           <w:tcPr>
-            <w:tcW w:type="dxa" w:w="1984"/>
+            <w:tcW w:type="dxa" w:w="1814"/>
           </w:tcPr>
           <w:p>
             <w:pPr>
@@ -1053,6 +1110,7 @@
               <w:rPr>
                 <w:b w:val="0"/>
                 <w:i w:val="0"/>
+                <w:sz w:val="22"/>
               </w:rPr>
               <w:t>{{h1}}</w:t>
             </w:r>
@@ -1062,13 +1120,14 @@
       <w:tr>
         <w:tc>
           <w:tcPr>
-            <w:tcW w:type="dxa" w:w="5102"/>
+            <w:tcW w:type="dxa" w:w="4989"/>
           </w:tcPr>
           <w:p>
             <w:r>
               <w:rPr>
                 <w:b w:val="0"/>
                 <w:i w:val="0"/>
+                <w:sz w:val="22"/>
               </w:rPr>
               <w:t>- Làm thêm giờ không chịu thuế</w:t>
             </w:r>
@@ -1076,7 +1135,7 @@
         </w:tc>
         <w:tc>
           <w:tcPr>
-            <w:tcW w:type="dxa" w:w="2551"/>
+            <w:tcW w:type="dxa" w:w="2835"/>
           </w:tcPr>
           <w:p>
             <w:pPr>
@@ -1086,6 +1145,7 @@
               <w:rPr>
                 <w:b w:val="0"/>
                 <w:i/>
+                <w:sz w:val="20"/>
               </w:rPr>
               <w:t>h2</w:t>
             </w:r>
@@ -1093,7 +1153,7 @@
         </w:tc>
         <w:tc>
           <w:tcPr>
-            <w:tcW w:type="dxa" w:w="1984"/>
+            <w:tcW w:type="dxa" w:w="1814"/>
           </w:tcPr>
           <w:p>
             <w:pPr>
@@ -1103,6 +1163,7 @@
               <w:rPr>
                 <w:b w:val="0"/>
                 <w:i w:val="0"/>
+                <w:sz w:val="22"/>
               </w:rPr>
               <w:t>{{h2}}</w:t>
             </w:r>
@@ -1112,13 +1173,14 @@
       <w:tr>
         <w:tc>
           <w:tcPr>
-            <w:tcW w:type="dxa" w:w="5102"/>
+            <w:tcW w:type="dxa" w:w="4989"/>
           </w:tcPr>
           <w:p>
             <w:r>
               <w:rPr>
                 <w:b/>
                 <w:i w:val="0"/>
+                <w:sz w:val="22"/>
               </w:rPr>
               <w:t>Bảo hiểm xã hội</w:t>
             </w:r>
@@ -1126,7 +1188,7 @@
         </w:tc>
         <w:tc>
           <w:tcPr>
-            <w:tcW w:type="dxa" w:w="2551"/>
+            <w:tcW w:type="dxa" w:w="2835"/>
           </w:tcPr>
           <w:p>
             <w:pPr>
@@ -1136,6 +1198,7 @@
               <w:rPr>
                 <w:b w:val="0"/>
                 <w:i/>
+                <w:sz w:val="20"/>
               </w:rPr>
               <w:t>i</w:t>
             </w:r>
@@ -1143,7 +1206,7 @@
         </w:tc>
         <w:tc>
           <w:tcPr>
-            <w:tcW w:type="dxa" w:w="1984"/>
+            <w:tcW w:type="dxa" w:w="1814"/>
           </w:tcPr>
           <w:p>
             <w:pPr>
@@ -1153,6 +1216,7 @@
               <w:rPr>
                 <w:b/>
                 <w:i w:val="0"/>
+                <w:sz w:val="22"/>
               </w:rPr>
               <w:t>{{i}}</w:t>
             </w:r>
@@ -1162,13 +1226,14 @@
       <w:tr>
         <w:tc>
           <w:tcPr>
-            <w:tcW w:type="dxa" w:w="5102"/>
+            <w:tcW w:type="dxa" w:w="4989"/>
           </w:tcPr>
           <w:p>
             <w:r>
               <w:rPr>
                 <w:b/>
                 <w:i w:val="0"/>
+                <w:sz w:val="22"/>
               </w:rPr>
               <w:t>Bảo hiểm y tế</w:t>
             </w:r>
@@ -1176,7 +1241,7 @@
         </w:tc>
         <w:tc>
           <w:tcPr>
-            <w:tcW w:type="dxa" w:w="2551"/>
+            <w:tcW w:type="dxa" w:w="2835"/>
           </w:tcPr>
           <w:p>
             <w:pPr>
@@ -1186,6 +1251,7 @@
               <w:rPr>
                 <w:b w:val="0"/>
                 <w:i/>
+                <w:sz w:val="20"/>
               </w:rPr>
               <w:t>j</w:t>
             </w:r>
@@ -1193,7 +1259,7 @@
         </w:tc>
         <w:tc>
           <w:tcPr>
-            <w:tcW w:type="dxa" w:w="1984"/>
+            <w:tcW w:type="dxa" w:w="1814"/>
           </w:tcPr>
           <w:p>
             <w:pPr>
@@ -1203,6 +1269,7 @@
               <w:rPr>
                 <w:b/>
                 <w:i w:val="0"/>
+                <w:sz w:val="22"/>
               </w:rPr>
               <w:t>{{j}}</w:t>
             </w:r>
@@ -1212,13 +1279,14 @@
       <w:tr>
         <w:tc>
           <w:tcPr>
-            <w:tcW w:type="dxa" w:w="5102"/>
+            <w:tcW w:type="dxa" w:w="4989"/>
           </w:tcPr>
           <w:p>
             <w:r>
               <w:rPr>
                 <w:b/>
                 <w:i w:val="0"/>
+                <w:sz w:val="22"/>
               </w:rPr>
               <w:t>Bảo hiểm thất nghiệp</w:t>
             </w:r>
@@ -1226,7 +1294,7 @@
         </w:tc>
         <w:tc>
           <w:tcPr>
-            <w:tcW w:type="dxa" w:w="2551"/>
+            <w:tcW w:type="dxa" w:w="2835"/>
           </w:tcPr>
           <w:p>
             <w:pPr>
@@ -1236,6 +1304,7 @@
               <w:rPr>
                 <w:b w:val="0"/>
                 <w:i/>
+                <w:sz w:val="20"/>
               </w:rPr>
               <w:t>k</w:t>
             </w:r>
@@ -1243,7 +1312,7 @@
         </w:tc>
         <w:tc>
           <w:tcPr>
-            <w:tcW w:type="dxa" w:w="1984"/>
+            <w:tcW w:type="dxa" w:w="1814"/>
           </w:tcPr>
           <w:p>
             <w:pPr>
@@ -1253,6 +1322,7 @@
               <w:rPr>
                 <w:b/>
                 <w:i w:val="0"/>
+                <w:sz w:val="22"/>
               </w:rPr>
               <w:t>{{k}}</w:t>
             </w:r>
@@ -1262,13 +1332,14 @@
       <w:tr>
         <w:tc>
           <w:tcPr>
-            <w:tcW w:type="dxa" w:w="5102"/>
+            <w:tcW w:type="dxa" w:w="4989"/>
           </w:tcPr>
           <w:p>
             <w:r>
               <w:rPr>
                 <w:b/>
                 <w:i w:val="0"/>
+                <w:sz w:val="22"/>
               </w:rPr>
               <w:t>Giảm trừ gia cảnh cho bản thân</w:t>
             </w:r>
@@ -1276,7 +1347,7 @@
         </w:tc>
         <w:tc>
           <w:tcPr>
-            <w:tcW w:type="dxa" w:w="2551"/>
+            <w:tcW w:type="dxa" w:w="2835"/>
           </w:tcPr>
           <w:p>
             <w:pPr>
@@ -1286,6 +1357,7 @@
               <w:rPr>
                 <w:b w:val="0"/>
                 <w:i/>
+                <w:sz w:val="20"/>
               </w:rPr>
               <w:t>l</w:t>
             </w:r>
@@ -1293,7 +1365,7 @@
         </w:tc>
         <w:tc>
           <w:tcPr>
-            <w:tcW w:type="dxa" w:w="1984"/>
+            <w:tcW w:type="dxa" w:w="1814"/>
           </w:tcPr>
           <w:p>
             <w:pPr>
@@ -1303,6 +1375,7 @@
               <w:rPr>
                 <w:b/>
                 <w:i w:val="0"/>
+                <w:sz w:val="22"/>
               </w:rPr>
               <w:t>{{l}}</w:t>
             </w:r>
@@ -1312,13 +1385,14 @@
       <w:tr>
         <w:tc>
           <w:tcPr>
-            <w:tcW w:type="dxa" w:w="5102"/>
+            <w:tcW w:type="dxa" w:w="4989"/>
           </w:tcPr>
           <w:p>
             <w:r>
               <w:rPr>
                 <w:b/>
                 <w:i w:val="0"/>
+                <w:sz w:val="22"/>
               </w:rPr>
               <w:t>Giảm trừ gia cảnh cho người phụ thuộc</w:t>
             </w:r>
@@ -1326,7 +1400,7 @@
         </w:tc>
         <w:tc>
           <w:tcPr>
-            <w:tcW w:type="dxa" w:w="2551"/>
+            <w:tcW w:type="dxa" w:w="2835"/>
           </w:tcPr>
           <w:p>
             <w:pPr>
@@ -1336,6 +1410,7 @@
               <w:rPr>
                 <w:b w:val="0"/>
                 <w:i/>
+                <w:sz w:val="20"/>
               </w:rPr>
               <w:t>m</w:t>
             </w:r>
@@ -1343,7 +1418,7 @@
         </w:tc>
         <w:tc>
           <w:tcPr>
-            <w:tcW w:type="dxa" w:w="1984"/>
+            <w:tcW w:type="dxa" w:w="1814"/>
           </w:tcPr>
           <w:p>
             <w:pPr>
@@ -1353,6 +1428,7 @@
               <w:rPr>
                 <w:b/>
                 <w:i w:val="0"/>
+                <w:sz w:val="22"/>
               </w:rPr>
               <w:t>{{m}}</w:t>
             </w:r>
@@ -1362,13 +1438,14 @@
       <w:tr>
         <w:tc>
           <w:tcPr>
-            <w:tcW w:type="dxa" w:w="5102"/>
+            <w:tcW w:type="dxa" w:w="4989"/>
           </w:tcPr>
           <w:p>
             <w:r>
               <w:rPr>
                 <w:b/>
                 <w:i w:val="0"/>
+                <w:sz w:val="22"/>
               </w:rPr>
               <w:t>Thu nhập chịu thuế</w:t>
             </w:r>
@@ -1376,7 +1453,7 @@
         </w:tc>
         <w:tc>
           <w:tcPr>
-            <w:tcW w:type="dxa" w:w="2551"/>
+            <w:tcW w:type="dxa" w:w="2835"/>
           </w:tcPr>
           <w:p>
             <w:pPr>
@@ -1386,6 +1463,7 @@
               <w:rPr>
                 <w:b w:val="0"/>
                 <w:i/>
+                <w:sz w:val="20"/>
               </w:rPr>
               <w:t>n = g − i − j − k − l − m</w:t>
             </w:r>
@@ -1393,7 +1471,7 @@
         </w:tc>
         <w:tc>
           <w:tcPr>
-            <w:tcW w:type="dxa" w:w="1984"/>
+            <w:tcW w:type="dxa" w:w="1814"/>
           </w:tcPr>
           <w:p>
             <w:pPr>
@@ -1403,6 +1481,7 @@
               <w:rPr>
                 <w:b/>
                 <w:i w:val="0"/>
+                <w:sz w:val="22"/>
               </w:rPr>
               <w:t>{{n}}</w:t>
             </w:r>
@@ -1412,13 +1491,14 @@
       <w:tr>
         <w:tc>
           <w:tcPr>
-            <w:tcW w:type="dxa" w:w="5102"/>
+            <w:tcW w:type="dxa" w:w="4989"/>
           </w:tcPr>
           <w:p>
             <w:r>
               <w:rPr>
                 <w:b/>
                 <w:i w:val="0"/>
+                <w:sz w:val="22"/>
               </w:rPr>
               <w:t>Thuế thu nhập cá nhân phải nộp</w:t>
             </w:r>
@@ -1426,7 +1506,7 @@
         </w:tc>
         <w:tc>
           <w:tcPr>
-            <w:tcW w:type="dxa" w:w="2551"/>
+            <w:tcW w:type="dxa" w:w="2835"/>
           </w:tcPr>
           <w:p>
             <w:pPr>
@@ -1436,6 +1516,7 @@
               <w:rPr>
                 <w:b w:val="0"/>
                 <w:i/>
+                <w:sz w:val="20"/>
               </w:rPr>
               <w:t>o = o1 + o2</w:t>
             </w:r>
@@ -1443,7 +1524,7 @@
         </w:tc>
         <w:tc>
           <w:tcPr>
-            <w:tcW w:type="dxa" w:w="1984"/>
+            <w:tcW w:type="dxa" w:w="1814"/>
           </w:tcPr>
           <w:p>
             <w:pPr>
@@ -1453,6 +1534,7 @@
               <w:rPr>
                 <w:b/>
                 <w:i w:val="0"/>
+                <w:sz w:val="22"/>
               </w:rPr>
               <w:t>{{o}}</w:t>
             </w:r>
@@ -1462,13 +1544,14 @@
       <w:tr>
         <w:tc>
           <w:tcPr>
-            <w:tcW w:type="dxa" w:w="5102"/>
+            <w:tcW w:type="dxa" w:w="4989"/>
           </w:tcPr>
           <w:p>
             <w:r>
               <w:rPr>
                 <w:b w:val="0"/>
                 <w:i w:val="0"/>
+                <w:sz w:val="22"/>
               </w:rPr>
               <w:t>- Thuế TNCN trong tháng</w:t>
             </w:r>
@@ -1476,7 +1559,7 @@
         </w:tc>
         <w:tc>
           <w:tcPr>
-            <w:tcW w:type="dxa" w:w="2551"/>
+            <w:tcW w:type="dxa" w:w="2835"/>
           </w:tcPr>
           <w:p>
             <w:pPr>
@@ -1486,6 +1569,7 @@
               <w:rPr>
                 <w:b w:val="0"/>
                 <w:i/>
+                <w:sz w:val="20"/>
               </w:rPr>
               <w:t>o1</w:t>
             </w:r>
@@ -1493,7 +1577,7 @@
         </w:tc>
         <w:tc>
           <w:tcPr>
-            <w:tcW w:type="dxa" w:w="1984"/>
+            <w:tcW w:type="dxa" w:w="1814"/>
           </w:tcPr>
           <w:p>
             <w:pPr>
@@ -1503,6 +1587,7 @@
               <w:rPr>
                 <w:b w:val="0"/>
                 <w:i w:val="0"/>
+                <w:sz w:val="22"/>
               </w:rPr>
               <w:t>{{o1}}</w:t>
             </w:r>
@@ -1512,13 +1597,14 @@
       <w:tr>
         <w:tc>
           <w:tcPr>
-            <w:tcW w:type="dxa" w:w="5102"/>
+            <w:tcW w:type="dxa" w:w="4989"/>
           </w:tcPr>
           <w:p>
             <w:r>
               <w:rPr>
                 <w:b w:val="0"/>
                 <w:i w:val="0"/>
+                <w:sz w:val="22"/>
               </w:rPr>
               <w:t>- Khấu trừ bổ sung thuế TNCN tháng trước</w:t>
             </w:r>
@@ -1526,7 +1612,7 @@
         </w:tc>
         <w:tc>
           <w:tcPr>
-            <w:tcW w:type="dxa" w:w="2551"/>
+            <w:tcW w:type="dxa" w:w="2835"/>
           </w:tcPr>
           <w:p>
             <w:pPr>
@@ -1536,6 +1622,7 @@
               <w:rPr>
                 <w:b w:val="0"/>
                 <w:i/>
+                <w:sz w:val="20"/>
               </w:rPr>
               <w:t>o2</w:t>
             </w:r>
@@ -1543,7 +1630,7 @@
         </w:tc>
         <w:tc>
           <w:tcPr>
-            <w:tcW w:type="dxa" w:w="1984"/>
+            <w:tcW w:type="dxa" w:w="1814"/>
           </w:tcPr>
           <w:p>
             <w:pPr>
@@ -1553,6 +1640,7 @@
               <w:rPr>
                 <w:b w:val="0"/>
                 <w:i w:val="0"/>
+                <w:sz w:val="22"/>
               </w:rPr>
               <w:t>{{o2}}</w:t>
             </w:r>
@@ -1562,13 +1650,14 @@
       <w:tr>
         <w:tc>
           <w:tcPr>
-            <w:tcW w:type="dxa" w:w="5102"/>
+            <w:tcW w:type="dxa" w:w="4989"/>
           </w:tcPr>
           <w:p>
             <w:r>
               <w:rPr>
                 <w:b/>
                 <w:i w:val="0"/>
+                <w:sz w:val="22"/>
               </w:rPr>
               <w:t>Các khoản giảm trừ khác</w:t>
             </w:r>
@@ -1576,7 +1665,7 @@
         </w:tc>
         <w:tc>
           <w:tcPr>
-            <w:tcW w:type="dxa" w:w="2551"/>
+            <w:tcW w:type="dxa" w:w="2835"/>
           </w:tcPr>
           <w:p>
             <w:pPr>
@@ -1586,6 +1675,7 @@
               <w:rPr>
                 <w:b w:val="0"/>
                 <w:i/>
+                <w:sz w:val="20"/>
               </w:rPr>
               <w:t>p</w:t>
             </w:r>
@@ -1593,7 +1683,7 @@
         </w:tc>
         <w:tc>
           <w:tcPr>
-            <w:tcW w:type="dxa" w:w="1984"/>
+            <w:tcW w:type="dxa" w:w="1814"/>
           </w:tcPr>
           <w:p>
             <w:pPr>
@@ -1603,6 +1693,7 @@
               <w:rPr>
                 <w:b/>
                 <w:i w:val="0"/>
+                <w:sz w:val="22"/>
               </w:rPr>
               <w:t>{{p}}</w:t>
             </w:r>
@@ -1612,7 +1703,7 @@
       <w:tr>
         <w:tc>
           <w:tcPr>
-            <w:tcW w:type="dxa" w:w="5102"/>
+            <w:tcW w:type="dxa" w:w="4989"/>
             <w:shd w:val="clear" w:color="auto" w:fill="FFF2CC"/>
           </w:tcPr>
           <w:p>
@@ -1620,6 +1711,7 @@
               <w:rPr>
                 <w:b/>
                 <w:i w:val="0"/>
+                <w:sz w:val="22"/>
               </w:rPr>
               <w:t>Thực lĩnh</w:t>
             </w:r>
@@ -1627,7 +1719,7 @@
         </w:tc>
         <w:tc>
           <w:tcPr>
-            <w:tcW w:type="dxa" w:w="2551"/>
+            <w:tcW w:type="dxa" w:w="2835"/>
             <w:shd w:val="clear" w:color="auto" w:fill="FFF2CC"/>
           </w:tcPr>
           <w:p>
@@ -1638,6 +1730,7 @@
               <w:rPr>
                 <w:b w:val="0"/>
                 <w:i/>
+                <w:sz w:val="20"/>
               </w:rPr>
               <w:t>q = g + h − i − j − k − o − p</w:t>
             </w:r>
@@ -1645,7 +1738,7 @@
         </w:tc>
         <w:tc>
           <w:tcPr>
-            <w:tcW w:type="dxa" w:w="1984"/>
+            <w:tcW w:type="dxa" w:w="1814"/>
             <w:shd w:val="clear" w:color="auto" w:fill="FFF2CC"/>
           </w:tcPr>
           <w:p>
@@ -1656,6 +1749,7 @@
               <w:rPr>
                 <w:b/>
                 <w:i w:val="0"/>
+                <w:sz w:val="22"/>
               </w:rPr>
               <w:t>{{q}}</w:t>
             </w:r>
@@ -1683,7 +1777,7 @@
         <w:rPr>
           <w:b w:val="0"/>
           <w:i w:val="0"/>
-          <w:sz w:val="22"/>
+          <w:sz w:val="20"/>
         </w:rPr>
         <w:t>{{ghiChu1}}</w:t>
       </w:r>
@@ -1696,7 +1790,7 @@
         <w:rPr>
           <w:b w:val="0"/>
           <w:i w:val="0"/>
-          <w:sz w:val="22"/>
+          <w:sz w:val="20"/>
         </w:rPr>
         <w:t>{{ghiChu2}}</w:t>
       </w:r>
@@ -1709,7 +1803,7 @@
         <w:rPr>
           <w:b w:val="0"/>
           <w:i w:val="0"/>
-          <w:sz w:val="22"/>
+          <w:sz w:val="20"/>
         </w:rPr>
         <w:t>{{ghiChu3}}</w:t>
       </w:r>
@@ -1722,14 +1816,14 @@
         <w:rPr>
           <w:b w:val="0"/>
           <w:i w:val="0"/>
-          <w:sz w:val="22"/>
+          <w:sz w:val="20"/>
         </w:rPr>
         <w:t>{{ghiChu4}}</w:t>
       </w:r>
     </w:p>
     <w:sectPr>
       <w:pgSz w:w="11906" w:h="16838"/>
-      <w:pgMar w:top="1020" w:right="1134" w:bottom="1020" w:left="1134" w:header="720" w:footer="720" w:gutter="0"/>
+      <w:pgMar w:top="850" w:right="1134" w:bottom="850" w:left="1134" w:header="720" w:footer="720" w:gutter="0"/>
       <w:cols w:space="720"/>
       <w:docGrid w:linePitch="360"/>
     </w:sectPr>

</xml_diff>